<commit_message>
refactor(chat): bỏ cột low/high và dùng external ID để chống gửi trùng
</commit_message>
<xml_diff>
--- a/docs/chat-api-erd.docx
+++ b/docs/chat-api-erd.docx
@@ -28,44 +28,7 @@
         <w:jc w:val="center"/>
       </w:pPr>
       <w:r>
-        <w:rPr>
-          <w:noProof/>
-        </w:rPr>
-        <w:drawing>
-          <wp:inline distT="0" distB="0" distL="0" distR="0" wp14:anchorId="403FCC46" wp14:editId="6A8C66C1">
-            <wp:extent cx="6492240" cy="4822807"/>
-            <wp:effectExtent l="0" t="0" r="0" b="0"/>
-            <wp:docPr id="1" name="Picture 1" descr="ERD 5 bảng Mini-Hermes; mỗi bảng có các cột tên thuộc tính, kiểu dữ liệu, khóa và khả năng NULL."/>
-            <wp:cNvGraphicFramePr>
-              <a:graphicFrameLocks xmlns:a="http://schemas.openxmlformats.org/drawingml/2006/main" noChangeAspect="1"/>
-            </wp:cNvGraphicFramePr>
-            <a:graphic xmlns:a="http://schemas.openxmlformats.org/drawingml/2006/main">
-              <a:graphicData uri="http://schemas.openxmlformats.org/drawingml/2006/picture">
-                <pic:pic xmlns:pic="http://schemas.openxmlformats.org/drawingml/2006/picture">
-                  <pic:nvPicPr>
-                    <pic:cNvPr id="0" name="mini-hermes-erd.png"/>
-                    <pic:cNvPicPr/>
-                  </pic:nvPicPr>
-                  <pic:blipFill>
-                    <a:blip r:embed="rId6"/>
-                    <a:stretch>
-                      <a:fillRect/>
-                    </a:stretch>
-                  </pic:blipFill>
-                  <pic:spPr>
-                    <a:xfrm>
-                      <a:off x="0" y="0"/>
-                      <a:ext cx="6492240" cy="4822807"/>
-                    </a:xfrm>
-                    <a:prstGeom prst="rect">
-                      <a:avLst/>
-                    </a:prstGeom>
-                  </pic:spPr>
-                </pic:pic>
-              </a:graphicData>
-            </a:graphic>
-          </wp:inline>
-        </w:drawing>
+        <w:t>Sơ đồ Mermaid chuẩn được duy trì trong docs/chat-api-erd.md.</w:t>
       </w:r>
     </w:p>
     <w:p>
@@ -765,7 +728,7 @@
     </w:p>
     <w:p>
       <w:r>
-        <w:t>Tập hợp thành viên và lịch sử của một cuộc trò chuyện. Cặp ID nhỏ/lớn giúp database chặn hai thread 1-1 cho cùng một cặp người, dù ai tạo trước.</w:t>
+        <w:t>Tập hợp metadata và lịch sử của một cuộc trò chuyện. Thành viên direct thread chỉ được lưu ở participants, không lặp lại cặp user trong threads.</w:t>
       </w:r>
     </w:p>
     <w:tbl>
@@ -1260,162 +1223,6 @@
                 <w:sz w:val="21"/>
               </w:rPr>
               <w:t>Tham chiếu users.id: người tạo thread. Quyền hiện tại được xác định bằng participants.role.</w:t>
-            </w:r>
-          </w:p>
-        </w:tc>
-      </w:tr>
-      <w:tr>
-        <w:trPr>
-          <w:cantSplit/>
-          <w:jc w:val="center"/>
-        </w:trPr>
-        <w:tc>
-          <w:tcPr>
-            <w:tcW w:w="2376" w:type="dxa"/>
-            <w:shd w:val="clear" w:color="auto" w:fill="FFFFFF"/>
-            <w:tcMar>
-              <w:top w:w="85" w:type="dxa"/>
-              <w:left w:w="85" w:type="dxa"/>
-              <w:bottom w:w="85" w:type="dxa"/>
-              <w:right w:w="85" w:type="dxa"/>
-            </w:tcMar>
-            <w:vAlign w:val="center"/>
-          </w:tcPr>
-          <w:p>
-            <w:pPr>
-              <w:spacing w:after="0" w:line="252" w:lineRule="auto"/>
-            </w:pPr>
-            <w:r>
-              <w:rPr>
-                <w:sz w:val="21"/>
-              </w:rPr>
-              <w:t>direct_user_low_id</w:t>
-            </w:r>
-          </w:p>
-        </w:tc>
-        <w:tc>
-          <w:tcPr>
-            <w:tcW w:w="1699" w:type="dxa"/>
-            <w:shd w:val="clear" w:color="auto" w:fill="FFFFFF"/>
-            <w:tcMar>
-              <w:top w:w="85" w:type="dxa"/>
-              <w:left w:w="85" w:type="dxa"/>
-              <w:bottom w:w="85" w:type="dxa"/>
-              <w:right w:w="85" w:type="dxa"/>
-            </w:tcMar>
-            <w:vAlign w:val="center"/>
-          </w:tcPr>
-          <w:p>
-            <w:pPr>
-              <w:spacing w:after="0" w:line="252" w:lineRule="auto"/>
-            </w:pPr>
-            <w:r>
-              <w:rPr>
-                <w:sz w:val="21"/>
-              </w:rPr>
-              <w:t>BIGINT</w:t>
-            </w:r>
-          </w:p>
-        </w:tc>
-        <w:tc>
-          <w:tcPr>
-            <w:tcW w:w="6149" w:type="dxa"/>
-            <w:shd w:val="clear" w:color="auto" w:fill="FFFFFF"/>
-            <w:tcMar>
-              <w:top w:w="85" w:type="dxa"/>
-              <w:left w:w="85" w:type="dxa"/>
-              <w:bottom w:w="85" w:type="dxa"/>
-              <w:right w:w="85" w:type="dxa"/>
-            </w:tcMar>
-            <w:vAlign w:val="center"/>
-          </w:tcPr>
-          <w:p>
-            <w:pPr>
-              <w:spacing w:after="0" w:line="252" w:lineRule="auto"/>
-            </w:pPr>
-            <w:r>
-              <w:rPr>
-                <w:sz w:val="21"/>
-              </w:rPr>
-              <w:t>Tham chiếu users.id: ID nhỏ hơn trong cặp 1-1. Group để NULL.</w:t>
-            </w:r>
-          </w:p>
-        </w:tc>
-      </w:tr>
-      <w:tr>
-        <w:trPr>
-          <w:cantSplit/>
-          <w:jc w:val="center"/>
-        </w:trPr>
-        <w:tc>
-          <w:tcPr>
-            <w:tcW w:w="2376" w:type="dxa"/>
-            <w:shd w:val="clear" w:color="auto" w:fill="FFFFFF"/>
-            <w:tcMar>
-              <w:top w:w="85" w:type="dxa"/>
-              <w:left w:w="85" w:type="dxa"/>
-              <w:bottom w:w="85" w:type="dxa"/>
-              <w:right w:w="85" w:type="dxa"/>
-            </w:tcMar>
-            <w:vAlign w:val="center"/>
-          </w:tcPr>
-          <w:p>
-            <w:pPr>
-              <w:spacing w:after="0" w:line="252" w:lineRule="auto"/>
-            </w:pPr>
-            <w:r>
-              <w:rPr>
-                <w:sz w:val="21"/>
-              </w:rPr>
-              <w:t>direct_user_high_id</w:t>
-            </w:r>
-          </w:p>
-        </w:tc>
-        <w:tc>
-          <w:tcPr>
-            <w:tcW w:w="1699" w:type="dxa"/>
-            <w:shd w:val="clear" w:color="auto" w:fill="FFFFFF"/>
-            <w:tcMar>
-              <w:top w:w="85" w:type="dxa"/>
-              <w:left w:w="85" w:type="dxa"/>
-              <w:bottom w:w="85" w:type="dxa"/>
-              <w:right w:w="85" w:type="dxa"/>
-            </w:tcMar>
-            <w:vAlign w:val="center"/>
-          </w:tcPr>
-          <w:p>
-            <w:pPr>
-              <w:spacing w:after="0" w:line="252" w:lineRule="auto"/>
-            </w:pPr>
-            <w:r>
-              <w:rPr>
-                <w:sz w:val="21"/>
-              </w:rPr>
-              <w:t>BIGINT</w:t>
-            </w:r>
-          </w:p>
-        </w:tc>
-        <w:tc>
-          <w:tcPr>
-            <w:tcW w:w="6149" w:type="dxa"/>
-            <w:shd w:val="clear" w:color="auto" w:fill="FFFFFF"/>
-            <w:tcMar>
-              <w:top w:w="85" w:type="dxa"/>
-              <w:left w:w="85" w:type="dxa"/>
-              <w:bottom w:w="85" w:type="dxa"/>
-              <w:right w:w="85" w:type="dxa"/>
-            </w:tcMar>
-            <w:vAlign w:val="center"/>
-          </w:tcPr>
-          <w:p>
-            <w:pPr>
-              <w:spacing w:after="0" w:line="252" w:lineRule="auto"/>
-            </w:pPr>
-            <w:r>
-              <w:rPr>
-                <w:sz w:val="21"/>
-              </w:rPr>
-              <w:t>Tham chiếu users.id: ID lớn hơn trong cặp 1-1. Group để NULL.</w:t>
             </w:r>
           </w:p>
         </w:tc>
@@ -2763,7 +2570,7 @@
               <w:rPr>
                 <w:sz w:val="21"/>
               </w:rPr>
-              <w:t>ID công khai của tin do server cấp; client có thể dùng để chống hiển thị lặp.</w:t>
+              <w:t>ID công khai và khóa retry toàn cục. Client sinh trước mỗi lần gửi logic, dùng lại khi retry; tin hệ thống về sau có thể dùng UUID mặc định do server/PostgreSQL sinh.</w:t>
             </w:r>
           </w:p>
         </w:tc>
@@ -2998,84 +2805,6 @@
                 <w:sz w:val="21"/>
               </w:rPr>
               <w:t>Thứ tự trong thread, bắt đầu từ 1; dùng sắp lịch sử, cursor và mốc đọc.</w:t>
-            </w:r>
-          </w:p>
-        </w:tc>
-      </w:tr>
-      <w:tr>
-        <w:trPr>
-          <w:cantSplit/>
-          <w:jc w:val="center"/>
-        </w:trPr>
-        <w:tc>
-          <w:tcPr>
-            <w:tcW w:w="2376" w:type="dxa"/>
-            <w:shd w:val="clear" w:color="auto" w:fill="FFFFFF"/>
-            <w:tcMar>
-              <w:top w:w="85" w:type="dxa"/>
-              <w:left w:w="85" w:type="dxa"/>
-              <w:bottom w:w="85" w:type="dxa"/>
-              <w:right w:w="85" w:type="dxa"/>
-            </w:tcMar>
-            <w:vAlign w:val="center"/>
-          </w:tcPr>
-          <w:p>
-            <w:pPr>
-              <w:spacing w:after="0" w:line="252" w:lineRule="auto"/>
-            </w:pPr>
-            <w:r>
-              <w:rPr>
-                <w:sz w:val="21"/>
-              </w:rPr>
-              <w:t>client_msg_id</w:t>
-            </w:r>
-          </w:p>
-        </w:tc>
-        <w:tc>
-          <w:tcPr>
-            <w:tcW w:w="1699" w:type="dxa"/>
-            <w:shd w:val="clear" w:color="auto" w:fill="FFFFFF"/>
-            <w:tcMar>
-              <w:top w:w="85" w:type="dxa"/>
-              <w:left w:w="85" w:type="dxa"/>
-              <w:bottom w:w="85" w:type="dxa"/>
-              <w:right w:w="85" w:type="dxa"/>
-            </w:tcMar>
-            <w:vAlign w:val="center"/>
-          </w:tcPr>
-          <w:p>
-            <w:pPr>
-              <w:spacing w:after="0" w:line="252" w:lineRule="auto"/>
-            </w:pPr>
-            <w:r>
-              <w:rPr>
-                <w:sz w:val="21"/>
-              </w:rPr>
-              <w:t>UUID</w:t>
-            </w:r>
-          </w:p>
-        </w:tc>
-        <w:tc>
-          <w:tcPr>
-            <w:tcW w:w="6149" w:type="dxa"/>
-            <w:shd w:val="clear" w:color="auto" w:fill="FFFFFF"/>
-            <w:tcMar>
-              <w:top w:w="85" w:type="dxa"/>
-              <w:left w:w="85" w:type="dxa"/>
-              <w:bottom w:w="85" w:type="dxa"/>
-              <w:right w:w="85" w:type="dxa"/>
-            </w:tcMar>
-            <w:vAlign w:val="center"/>
-          </w:tcPr>
-          <w:p>
-            <w:pPr>
-              <w:spacing w:after="0" w:line="252" w:lineRule="auto"/>
-            </w:pPr>
-            <w:r>
-              <w:rPr>
-                <w:sz w:val="21"/>
-              </w:rPr>
-              <w:t>Client sinh cho mỗi lần chủ động gửi, giữ nguyên khi retry. Bắt buộc với tin text; NULL với tin system.</w:t>
             </w:r>
           </w:p>
         </w:tc>
@@ -4368,7 +4097,7 @@
               <w:rPr>
                 <w:sz w:val="21"/>
               </w:rPr>
-              <w:t>Direct có low &lt; high và UNIQUE(direct_user_low_id, direct_user_high_id). Group để hai cột này NULL. Tạo đúng hai participant cho direct trong cùng transaction.</w:t>
+              <w:t>Direct thread lưu thành viên duy nhất trong participants. Tạo/mở khóa hai user theo ID tăng dần, tìm đúng cặp active participant, rồi tạo thread và hai participant trong cùng transaction.</w:t>
             </w:r>
           </w:p>
         </w:tc>
@@ -4476,7 +4205,7 @@
               <w:rPr>
                 <w:sz w:val="21"/>
               </w:rPr>
-              <w:t>UNIQUE(thread_id, seq) và UNIQUE(thread_id, sender_id, client_msg_id). Retry cùng mã và nội dung trả lại tin cũ; khác nội dung thì báo conflict.</w:t>
+              <w:t>UNIQUE(thread_id, seq) và UNIQUE(external_id). Retry chỉ trả tin cũ khi UUID khớp sender, thread và nội dung; cách dùng lại khác báo conflict.</w:t>
             </w:r>
           </w:p>
         </w:tc>

</xml_diff>